<commit_message>
Add footnotes text file and update binary documents
- Introduced a new text file, Cry1Ab_FFS_original_footnotes.txt, containing detailed footnotes related to GE crops and regulatory approvals.
- Updated binary documents Cry1Ab_FFS_original_footnotes.docx, Cry1Ab_FFS_original_tables.docx, and Cry1Ab_FFS_original_text.docx to reflect recent changes.
</commit_message>
<xml_diff>
--- a/docs/Cry1Ab_FFS_original_text.docx
+++ b/docs/Cry1Ab_FFS_original_text.docx
@@ -5204,22 +5204,6 @@
         <w:spacing w:before="120" w:after="120" w:line="276" w:lineRule="auto"/>
       </w:pPr>
       <w:r>
-        <w:rPr/>
-        <w:fldChar w:fldCharType="begin" w:fldLock="1"/>
-      </w:r>
-      <w:r>
-        <w:rPr/>
-        <w:instrText>ADDIN CSL_CITATION { "citationItems" : [ { "id" : "ITEM-1", "itemData" : { "abstract" : "This minireview discusses the risks to humans and large mammals associated with the use of Bacillus thuringiensis var. kurstaki (Btk) in forest, agricultural and urban environments. The first subspecies used for insect control was Bacillus thuringiensis subsp. thuringiensis (Btt), known at the time as Bt Berliner. Much of the early work done with Bt does not identify the subspecies. Btk is registered for use against many species that are pests in agriculture, forestry and horticulture. Btk is currently the most widely used insecticide in forestry in Canada. Review of the literature indicates that Btk is safe for the environment and its various components. Since its introduction in the 1960s, no scientifically documented case of human infection has been reported as a result of its use in forestry or agriculture against various defoliators or in urban environments during gypsy moth eradication programs. No human health problems have been proven to be attributable to the application of any Bt product on crops used for human consumption. Based on all available information, Btk is considered by most people to be the safest bioinsecticide available at present.", "author" : [ { "dropping-particle" : "", "family" : "Otvos", "given" : "I.S.", "non-dropping-particle" : "", "parse-names" : false, "suffix" : "" }, { "dropping-particle" : "", "family" : "Armstrong", "given" : "H.", "non-dropping-particle" : "", "parse-names" : false, "suffix" : "" }, { "dropping-particle" : "", "family" : "Conder", "given" : "N.", "non-dropping-particle" : "", "parse-names" : false, "suffix" : "" } ], "container-title" : "Proceedings of the 6th Pacific Rim Conference on the Biotechnology of Bacillus Thuringiensis and its Environmental Impact.", "id" : "ITEM-1", "issued" : { "date-parts" : [ [ "2005" ] ] }, "page" : "45-60", "publisher-place" : "Victoria BC", "title" : "Safety of Bacillus thuringiensis var. kurstaki applications for insect control to humans and large mammals.", "type" : "paper-conference" }, "uris" : [ "http://www.mendeley.com/documents/?uuid=4d761e1b-2598-401f-8790-ea0302269b60" ] } ], "mendeley" : { "formattedCitation" : "[101]", "plainTextFormattedCitation" : "[101]", "previouslyFormattedCitation" : "[101]" }, "properties" : { "noteIndex" : 0 }, "schema" : "https://github.com/citation-style-language/schema/raw/master/csl-citation.json" }</w:instrText>
-      </w:r>
-      <w:r>
-        <w:rPr/>
-        <w:fldChar w:fldCharType="separate"/>
-      </w:r>
-      <w:r>
-        <w:rPr/>
-        <w:fldChar w:fldCharType="end"/>
-      </w:r>
-      <w:r>
         <w:rPr>
           <w:iCs/>
         </w:rPr>
@@ -5897,18 +5881,6 @@
         <w:t xml:space="preserve"> </w:t>
       </w:r>
       <w:r>
-        <w:rPr/>
-        <w:fldChar w:fldCharType="begin" w:fldLock="1"/>
-      </w:r>
-      <w:r>
-        <w:rPr/>
-        <w:instrText>ADDIN CSL_CITATION { "citationItems" : [ { "id" : "ITEM-1", "itemData" : { "ISBN" : "92-9199-019-1", "URL" : "http://www.efsa.europa.eu/en/scdocs/doc/gmo_guidance_derived_feed_food.pdf", "accessed" : { "date-parts" : [ [ "2015", "7", "27" ] ] }, "author" : [ { "dropping-particle" : "", "family" : "EFSA GMO Panel", "given" : "", "non-dropping-particle" : "", "parse-names" : false, "suffix" : "" } ], "container-title" : "The EFSA Journal", "id" : "ITEM-1", "issued" : { "date-parts" : [ [ "2006" ] ] }, "page" : "1-100", "title" : "Guidance document of the Scientific Panel on Genetically Modified Organisms for the risk assessment of genetically modified plants and derived food and feed. European Food Safety Authority (EFSA)\uff0c Brussels, Belgium.", "type" : "webpage", "volume" : "99" }, "uris" : [ "http://www.mendeley.com/documents/?uuid=a60cdef2-d972-48de-8a03-0c883b0157a6" ] }, { "id" : "ITEM-2", "itemData" : { "DOI" : "10.2903/j.efsa.2011.2150", "URL" : "http://www.efsa.europa.eu/en/efsajournal/pub/2150", "accessed" : { "date-parts" : [ [ "2015", "9", "4" ] ] }, "author" : [ { "dropping-particle" : "", "family" : "EFSA", "given" : "", "non-dropping-particle" : "", "parse-names" : false, "suffix" : "" } ], "container-title" : "EFSA Journal", "id" : "ITEM-2", "issue" : "5", "issued" : { "date-parts" : [ [ "2011" ] ] }, "page" : "2150", "title" : "Guidance for risk assessment of food and feed from genetically modified plants.", "type" : "webpage", "volume" : "9" }, "uris" : [ "http://www.mendeley.com/documents/?uuid=be787062-cac9-44a7-82b0-611a7d2c3ae2" ] }, { "id" : "ITEM-3", "itemData" : { "URL" : "ftp://ftp.fao.org/codex/publications/Booklets/Biotech/Biotech_2009e.pdf", "accessed" : { "date-parts" : [ [ "2015", "9", "4" ] ] }, "author" : [ { "dropping-particle" : "", "family" : "Codex", "given" : "", "non-dropping-particle" : "", "parse-names" : false, "suffix" : "" } ], "id" : "ITEM-3", "issued" : { "date-parts" : [ [ "2009" ] ] }, "publisher-place" : "Rome, Italy", "title" : "Foods derived from modern biotechnology", "type" : "webpage" }, "uris" : [ "http://www.mendeley.com/documents/?uuid=e4e310af-29c1-47f7-be4f-8d812679d8d1" ] }, { "id" : "ITEM-4", "itemData" : { "DOI" : "10.1289/ehp.8803", "ISSN" : "0091-6765", "PMID" : "16882518", "abstract" : "The food-allergy risk assessment for transgenic proteins expressed in crops is currently based on a weight-of-evidence approach that holistically considers multiple lines of evidence. This approach recognizes that no single test or property is known to distinguish allergens from nonallergens. The stability of a protein to digestion, as predicted by an in vitro simulated gastric fluid assay, currently is used as one element in the risk assessment process. A review of the literature on the use of the simulated gastric fluid assay to predict the allergenic status of proteins suggests that more extensive kinetic studies with well-characterized reference proteins are required before the predictive value of this assay can be adequately judged.", "author" : [ { "dropping-particle" : "", "family" : "Herman", "given" : "Rod A.", "non-dropping-particle" : "", "parse-names" : false, "suffix" : "" }, { "dropping-particle" : "", "family" : "Storer", "given" : "Nicholas P.", "non-dropping-particle" : "", "parse-names" : false, "suffix" : "" }, { "dropping-particle" : "", "family" : "Gao", "given" : "Yong", "non-dropping-particle" : "", "parse-names" : false, "suffix" : "" } ], "container-title" : "Environmental Health Perspectives", "id" : "ITEM-4", "issue" : "8", "issued" : { "date-parts" : [ [ "2006", "5", "10" ] ] }, "page" : "1154-1157", "title" : "Digestion Assays in Allergenicity Assessment of Transgenic Proteins", "type" : "article-journal", "volume" : "114" }, "uris" : [ "http://www.mendeley.com/documents/?uuid=01149dfd-ce11-4958-b469-29fff6989cb7" ] } ], "mendeley" : { "formattedCitation" : "[4], [162], [164], [165]", "plainTextFormattedCitation" : "[4], [162], [164], [165]", "previouslyFormattedCitation" : "[4], [162], [164], [165]" }, "properties" : { "noteIndex" : 0 }, "schema" : "https://github.com/citation-style-language/schema/raw/master/csl-citation.json" }</w:instrText>
-      </w:r>
-      <w:r>
-        <w:rPr/>
-        <w:fldChar w:fldCharType="separate"/>
-      </w:r>
-      <w:r>
         <w:rPr>
           <w:noProof/>
         </w:rPr>
@@ -5929,10 +5901,6 @@
           <w:noProof/>
         </w:rPr>
         <w:t xml:space="preserve">, </w:t>
-      </w:r>
-      <w:r>
-        <w:rPr/>
-        <w:fldChar w:fldCharType="end"/>
       </w:r>
       <w:r>
         <w:rPr/>

</xml_diff>